<commit_message>
add proper template i/o
</commit_message>
<xml_diff>
--- a/report/draft/intermediate_files/template-clean.docx
+++ b/report/draft/intermediate_files/template-clean.docx
@@ -5,68 +5,97 @@
     <w:p>
       <w:pPr>
         <w:pStyle w:val="Caption"/>
-        <w:keepNext/>
       </w:pPr>
       <w:r>
         <w:t xml:space="preserve">Table </w:t>
       </w:r>
-      <w:fldSimple w:instr=" SEQ Table \* ARABIC ">
-        <w:r>
-          <w:rPr>
-            <w:noProof/>
-          </w:rPr>
-          <w:t>1</w:t>
-        </w:r>
-      </w:fldSimple>
+      <w:r>
+        <w:fldChar w:fldCharType="begin"/>
+      </w:r>
+      <w:r>
+        <w:instrText xml:space="preserve"> SEQ Table \* ARABIC </w:instrText>
+      </w:r>
+      <w:r>
+        <w:fldChar w:fldCharType="separate"/>
+      </w:r>
+      <w:r>
+        <w:rPr>
+          <w:noProof/>
+        </w:rPr>
+        <w:t>1</w:t>
+      </w:r>
+      <w:r>
+        <w:rPr>
+          <w:noProof/>
+        </w:rPr>
+        <w:fldChar w:fldCharType="end"/>
+      </w:r>
       <w:r>
         <w:t>: Pharmacokinetic Parameters of Theophylline</w:t>
       </w:r>
     </w:p>
     <w:p>
-      <w:pPr>
-        <w:keepNext/>
-      </w:pPr>
-      <w:r>
-        <w:t>{rpfy}:theoph-pk-parameters.csv</w:t>
+      <w:r>
+        <w:t>{</w:t>
+      </w:r>
+      <w:proofErr w:type="spellStart"/>
+      <w:r>
+        <w:t>rpfy</w:t>
+      </w:r>
+      <w:proofErr w:type="spellEnd"/>
+      <w:r>
+        <w:t>}:theoph-pk-parameters.csv</w:t>
       </w:r>
     </w:p>
     <w:p/>
     <w:p>
       <w:pPr>
         <w:pStyle w:val="Caption"/>
-        <w:keepNext/>
       </w:pPr>
       <w:r>
         <w:t xml:space="preserve">Figure </w:t>
       </w:r>
-      <w:fldSimple w:instr=" SEQ Figure \* ARABIC ">
-        <w:r>
-          <w:rPr>
-            <w:noProof/>
-          </w:rPr>
-          <w:t>1</w:t>
-        </w:r>
-      </w:fldSimple>
+      <w:r>
+        <w:fldChar w:fldCharType="begin"/>
+      </w:r>
+      <w:r>
+        <w:instrText xml:space="preserve"> SEQ Figure \* ARABIC </w:instrText>
+      </w:r>
+      <w:r>
+        <w:fldChar w:fldCharType="separate"/>
+      </w:r>
+      <w:r>
+        <w:rPr>
+          <w:noProof/>
+        </w:rPr>
+        <w:t>1</w:t>
+      </w:r>
+      <w:r>
+        <w:fldChar w:fldCharType="end"/>
+      </w:r>
       <w:r>
         <w:t>: Linear Regression of AUC and Subject Weight</w:t>
       </w:r>
     </w:p>
     <w:p>
-      <w:pPr>
-        <w:keepNext/>
-      </w:pPr>
-      <w:r>
-        <w:t>{rpfy}:theoph-pk-exposure.png&lt;width: 6.0, height: 4.0&gt;</w:t>
+      <w:r>
+        <w:t>{</w:t>
+      </w:r>
+      <w:proofErr w:type="spellStart"/>
+      <w:r>
+        <w:t>rpfy</w:t>
+      </w:r>
+      <w:proofErr w:type="spellEnd"/>
+      <w:r>
+        <w:t>}:theoph-pk-exposure.png</w:t>
       </w:r>
     </w:p>
     <w:p/>
     <w:p>
       <w:pPr>
         <w:pStyle w:val="Caption"/>
-        <w:keepNext/>
       </w:pPr>
       <w:r>
-        <w:lastRenderedPageBreak/>
         <w:t xml:space="preserve">Figure </w:t>
       </w:r>
       <w:r>
@@ -85,29 +114,27 @@
         <w:t>2</w:t>
       </w:r>
       <w:r>
-        <w:rPr>
-          <w:noProof/>
-        </w:rPr>
         <w:fldChar w:fldCharType="end"/>
       </w:r>
       <w:r>
-        <w:t xml:space="preserve">: </w:t>
-      </w:r>
-      <w:r>
-        <w:t>Observed Theophylline Concentration–Time Profiles</w:t>
+        <w:t>: Observed Theophylline Concentration-Time Profiles</w:t>
       </w:r>
     </w:p>
     <w:p>
-      <w:pPr>
-        <w:keepNext/>
-      </w:pPr>
-      <w:r>
-        <w:t>{rpfy}:theoph-pk-conc.png&lt;width: 6.0, height: 4.0&gt;</w:t>
+      <w:r>
+        <w:t>{</w:t>
+      </w:r>
+      <w:proofErr w:type="spellStart"/>
+      <w:r>
+        <w:t>rpfy</w:t>
+      </w:r>
+      <w:proofErr w:type="spellEnd"/>
+      <w:r>
+        <w:t>}:theoph-pk-conc.png</w:t>
       </w:r>
     </w:p>
     <w:p/>
     <w:sectPr>
-      <w:type w:val="continuous"/>
       <w:pgSz w:w="12240" w:h="15840"/>
       <w:pgMar w:top="1440" w:right="1440" w:bottom="1440" w:left="1440" w:header="720" w:footer="720" w:gutter="0"/>
       <w:cols w:space="720"/>
@@ -130,7 +157,11 @@
         <w14:ligatures w14:val="standardContextual"/>
       </w:rPr>
     </w:rPrDefault>
-    <w:pPrDefault/>
+    <w:pPrDefault>
+      <w:pPr>
+        <w:spacing w:after="160" w:line="278" w:lineRule="auto"/>
+      </w:pPr>
+    </w:pPrDefault>
   </w:docDefaults>
   <w:latentStyles w:defLockedState="0" w:defUIPriority="99" w:defSemiHidden="0" w:defUnhideWhenUsed="0" w:defQFormat="0" w:count="376">
     <w:lsdException w:name="Normal" w:uiPriority="0" w:qFormat="1"/>
@@ -521,7 +552,7 @@
     <w:link w:val="Heading1Char"/>
     <w:uiPriority w:val="9"/>
     <w:qFormat/>
-    <w:rsid w:val="006A5A9F"/>
+    <w:rsid w:val="00290F89"/>
     <w:pPr>
       <w:keepNext/>
       <w:keepLines/>
@@ -544,7 +575,7 @@
     <w:semiHidden/>
     <w:unhideWhenUsed/>
     <w:qFormat/>
-    <w:rsid w:val="006A5A9F"/>
+    <w:rsid w:val="00290F89"/>
     <w:pPr>
       <w:keepNext/>
       <w:keepLines/>
@@ -567,7 +598,7 @@
     <w:semiHidden/>
     <w:unhideWhenUsed/>
     <w:qFormat/>
-    <w:rsid w:val="006A5A9F"/>
+    <w:rsid w:val="00290F89"/>
     <w:pPr>
       <w:keepNext/>
       <w:keepLines/>
@@ -590,7 +621,7 @@
     <w:semiHidden/>
     <w:unhideWhenUsed/>
     <w:qFormat/>
-    <w:rsid w:val="006A5A9F"/>
+    <w:rsid w:val="00290F89"/>
     <w:pPr>
       <w:keepNext/>
       <w:keepLines/>
@@ -613,7 +644,7 @@
     <w:semiHidden/>
     <w:unhideWhenUsed/>
     <w:qFormat/>
-    <w:rsid w:val="006A5A9F"/>
+    <w:rsid w:val="00290F89"/>
     <w:pPr>
       <w:keepNext/>
       <w:keepLines/>
@@ -634,11 +665,11 @@
     <w:semiHidden/>
     <w:unhideWhenUsed/>
     <w:qFormat/>
-    <w:rsid w:val="006A5A9F"/>
+    <w:rsid w:val="00290F89"/>
     <w:pPr>
       <w:keepNext/>
       <w:keepLines/>
-      <w:spacing w:before="40"/>
+      <w:spacing w:before="40" w:after="0"/>
       <w:outlineLvl w:val="5"/>
     </w:pPr>
     <w:rPr>
@@ -657,11 +688,11 @@
     <w:semiHidden/>
     <w:unhideWhenUsed/>
     <w:qFormat/>
-    <w:rsid w:val="006A5A9F"/>
+    <w:rsid w:val="00290F89"/>
     <w:pPr>
       <w:keepNext/>
       <w:keepLines/>
-      <w:spacing w:before="40"/>
+      <w:spacing w:before="40" w:after="0"/>
       <w:outlineLvl w:val="6"/>
     </w:pPr>
     <w:rPr>
@@ -678,10 +709,11 @@
     <w:semiHidden/>
     <w:unhideWhenUsed/>
     <w:qFormat/>
-    <w:rsid w:val="006A5A9F"/>
+    <w:rsid w:val="00290F89"/>
     <w:pPr>
       <w:keepNext/>
       <w:keepLines/>
+      <w:spacing w:after="0"/>
       <w:outlineLvl w:val="7"/>
     </w:pPr>
     <w:rPr>
@@ -700,10 +732,11 @@
     <w:semiHidden/>
     <w:unhideWhenUsed/>
     <w:qFormat/>
-    <w:rsid w:val="006A5A9F"/>
+    <w:rsid w:val="00290F89"/>
     <w:pPr>
       <w:keepNext/>
       <w:keepLines/>
+      <w:spacing w:after="0"/>
       <w:outlineLvl w:val="8"/>
     </w:pPr>
     <w:rPr>
@@ -738,139 +771,12 @@
     <w:semiHidden/>
     <w:unhideWhenUsed/>
   </w:style>
-  <w:style w:type="paragraph" w:styleId="TOC1">
-    <w:name w:val="toc 1"/>
-    <w:aliases w:val="TOC 1 - Quarto"/>
-    <w:basedOn w:val="Normal"/>
-    <w:next w:val="Normal"/>
-    <w:autoRedefine/>
-    <w:uiPriority w:val="39"/>
-    <w:semiHidden/>
-    <w:unhideWhenUsed/>
-    <w:rsid w:val="00C0551F"/>
-    <w:pPr>
-      <w:keepNext/>
-      <w:pageBreakBefore/>
-      <w:spacing w:after="100"/>
-    </w:pPr>
-    <w:rPr>
-      <w:sz w:val="40"/>
-    </w:rPr>
-  </w:style>
-  <w:style w:type="paragraph" w:styleId="Caption">
-    <w:name w:val="caption"/>
-    <w:basedOn w:val="Normal"/>
-    <w:next w:val="Normal"/>
-    <w:uiPriority w:val="35"/>
-    <w:unhideWhenUsed/>
-    <w:qFormat/>
-    <w:rsid w:val="00F66170"/>
-    <w:pPr>
-      <w:spacing w:after="200"/>
-      <w:contextualSpacing/>
-    </w:pPr>
-    <w:rPr>
-      <w:i/>
-      <w:iCs/>
-      <w:color w:val="0E2841" w:themeColor="text2"/>
-      <w:sz w:val="18"/>
-      <w:szCs w:val="18"/>
-    </w:rPr>
-  </w:style>
-  <w:style w:type="paragraph" w:styleId="TOC4">
-    <w:name w:val="toc 4"/>
-    <w:basedOn w:val="TOC3"/>
-    <w:next w:val="Normal"/>
-    <w:autoRedefine/>
-    <w:uiPriority w:val="39"/>
-    <w:unhideWhenUsed/>
-    <w:rsid w:val="009F3CFA"/>
-    <w:pPr>
-      <w:tabs>
-        <w:tab w:val="left" w:pos="1100"/>
-        <w:tab w:val="right" w:leader="dot" w:pos="9350"/>
-      </w:tabs>
-      <w:ind w:left="720"/>
-    </w:pPr>
-    <w:rPr>
-      <w:rFonts w:ascii="Times New Roman" w:eastAsia="Times New Roman" w:hAnsi="Times New Roman" w:cstheme="minorHAnsi"/>
-      <w:kern w:val="0"/>
-      <w:sz w:val="20"/>
-      <w:szCs w:val="20"/>
-      <w14:ligatures w14:val="none"/>
-    </w:rPr>
-  </w:style>
-  <w:style w:type="paragraph" w:styleId="TOC3">
-    <w:name w:val="toc 3"/>
-    <w:basedOn w:val="Normal"/>
-    <w:next w:val="Normal"/>
-    <w:autoRedefine/>
-    <w:uiPriority w:val="39"/>
-    <w:semiHidden/>
-    <w:unhideWhenUsed/>
-    <w:rsid w:val="009F3CFA"/>
-    <w:pPr>
-      <w:spacing w:after="100"/>
-      <w:ind w:left="480"/>
-    </w:pPr>
-  </w:style>
-  <w:style w:type="paragraph" w:customStyle="1" w:styleId="ImageCaption">
-    <w:name w:val="Image Caption"/>
-    <w:basedOn w:val="Caption"/>
-    <w:autoRedefine/>
-    <w:qFormat/>
-    <w:rsid w:val="00B41CDC"/>
-    <w:pPr>
-      <w:spacing w:after="120"/>
-      <w:contextualSpacing w:val="0"/>
-      <w:jc w:val="center"/>
-    </w:pPr>
-    <w:rPr>
-      <w:iCs w:val="0"/>
-      <w:color w:val="auto"/>
-      <w:kern w:val="0"/>
-      <w:sz w:val="24"/>
-      <w:szCs w:val="24"/>
-      <w14:ligatures w14:val="none"/>
-    </w:rPr>
-  </w:style>
-  <w:style w:type="table" w:customStyle="1" w:styleId="GSKTableStyle">
-    <w:name w:val="GSK Table Style"/>
-    <w:rsid w:val="00527452"/>
-    <w:pPr>
-      <w:spacing w:after="240"/>
-    </w:pPr>
-    <w:rPr>
-      <w:rFonts w:ascii="Arial Narrow" w:eastAsia="Batang" w:hAnsi="Arial Narrow" w:cs="Times New Roman"/>
-      <w:kern w:val="0"/>
-      <w:sz w:val="20"/>
-      <w:szCs w:val="20"/>
-      <w14:ligatures w14:val="none"/>
-    </w:rPr>
-    <w:tblPr>
-      <w:tblInd w:w="0" w:type="dxa"/>
-      <w:tblBorders>
-        <w:top w:val="single" w:sz="4" w:space="0" w:color="auto"/>
-        <w:left w:val="single" w:sz="4" w:space="0" w:color="auto"/>
-        <w:bottom w:val="single" w:sz="4" w:space="0" w:color="auto"/>
-        <w:right w:val="single" w:sz="4" w:space="0" w:color="auto"/>
-        <w:insideH w:val="single" w:sz="4" w:space="0" w:color="auto"/>
-        <w:insideV w:val="single" w:sz="4" w:space="0" w:color="auto"/>
-      </w:tblBorders>
-      <w:tblCellMar>
-        <w:top w:w="0" w:type="dxa"/>
-        <w:left w:w="108" w:type="dxa"/>
-        <w:bottom w:w="0" w:type="dxa"/>
-        <w:right w:w="108" w:type="dxa"/>
-      </w:tblCellMar>
-    </w:tblPr>
-  </w:style>
   <w:style w:type="character" w:customStyle="1" w:styleId="Heading1Char">
     <w:name w:val="Heading 1 Char"/>
     <w:basedOn w:val="DefaultParagraphFont"/>
     <w:link w:val="Heading1"/>
     <w:uiPriority w:val="9"/>
-    <w:rsid w:val="006A5A9F"/>
+    <w:rsid w:val="00290F89"/>
     <w:rPr>
       <w:rFonts w:asciiTheme="majorHAnsi" w:eastAsiaTheme="majorEastAsia" w:hAnsiTheme="majorHAnsi" w:cstheme="majorBidi"/>
       <w:color w:val="0F4761" w:themeColor="accent1" w:themeShade="BF"/>
@@ -884,7 +790,7 @@
     <w:link w:val="Heading2"/>
     <w:uiPriority w:val="9"/>
     <w:semiHidden/>
-    <w:rsid w:val="006A5A9F"/>
+    <w:rsid w:val="00290F89"/>
     <w:rPr>
       <w:rFonts w:asciiTheme="majorHAnsi" w:eastAsiaTheme="majorEastAsia" w:hAnsiTheme="majorHAnsi" w:cstheme="majorBidi"/>
       <w:color w:val="0F4761" w:themeColor="accent1" w:themeShade="BF"/>
@@ -898,7 +804,7 @@
     <w:link w:val="Heading3"/>
     <w:uiPriority w:val="9"/>
     <w:semiHidden/>
-    <w:rsid w:val="006A5A9F"/>
+    <w:rsid w:val="00290F89"/>
     <w:rPr>
       <w:rFonts w:eastAsiaTheme="majorEastAsia" w:cstheme="majorBidi"/>
       <w:color w:val="0F4761" w:themeColor="accent1" w:themeShade="BF"/>
@@ -912,7 +818,7 @@
     <w:link w:val="Heading4"/>
     <w:uiPriority w:val="9"/>
     <w:semiHidden/>
-    <w:rsid w:val="006A5A9F"/>
+    <w:rsid w:val="00290F89"/>
     <w:rPr>
       <w:rFonts w:eastAsiaTheme="majorEastAsia" w:cstheme="majorBidi"/>
       <w:i/>
@@ -926,7 +832,7 @@
     <w:link w:val="Heading5"/>
     <w:uiPriority w:val="9"/>
     <w:semiHidden/>
-    <w:rsid w:val="006A5A9F"/>
+    <w:rsid w:val="00290F89"/>
     <w:rPr>
       <w:rFonts w:eastAsiaTheme="majorEastAsia" w:cstheme="majorBidi"/>
       <w:color w:val="0F4761" w:themeColor="accent1" w:themeShade="BF"/>
@@ -938,7 +844,7 @@
     <w:link w:val="Heading6"/>
     <w:uiPriority w:val="9"/>
     <w:semiHidden/>
-    <w:rsid w:val="006A5A9F"/>
+    <w:rsid w:val="00290F89"/>
     <w:rPr>
       <w:rFonts w:eastAsiaTheme="majorEastAsia" w:cstheme="majorBidi"/>
       <w:i/>
@@ -952,7 +858,7 @@
     <w:link w:val="Heading7"/>
     <w:uiPriority w:val="9"/>
     <w:semiHidden/>
-    <w:rsid w:val="006A5A9F"/>
+    <w:rsid w:val="00290F89"/>
     <w:rPr>
       <w:rFonts w:eastAsiaTheme="majorEastAsia" w:cstheme="majorBidi"/>
       <w:color w:val="595959" w:themeColor="text1" w:themeTint="A6"/>
@@ -964,7 +870,7 @@
     <w:link w:val="Heading8"/>
     <w:uiPriority w:val="9"/>
     <w:semiHidden/>
-    <w:rsid w:val="006A5A9F"/>
+    <w:rsid w:val="00290F89"/>
     <w:rPr>
       <w:rFonts w:eastAsiaTheme="majorEastAsia" w:cstheme="majorBidi"/>
       <w:i/>
@@ -978,7 +884,7 @@
     <w:link w:val="Heading9"/>
     <w:uiPriority w:val="9"/>
     <w:semiHidden/>
-    <w:rsid w:val="006A5A9F"/>
+    <w:rsid w:val="00290F89"/>
     <w:rPr>
       <w:rFonts w:eastAsiaTheme="majorEastAsia" w:cstheme="majorBidi"/>
       <w:color w:val="272727" w:themeColor="text1" w:themeTint="D8"/>
@@ -991,9 +897,9 @@
     <w:link w:val="TitleChar"/>
     <w:uiPriority w:val="10"/>
     <w:qFormat/>
-    <w:rsid w:val="006A5A9F"/>
+    <w:rsid w:val="00290F89"/>
     <w:pPr>
-      <w:spacing w:after="80"/>
+      <w:spacing w:after="80" w:line="240" w:lineRule="auto"/>
       <w:contextualSpacing/>
     </w:pPr>
     <w:rPr>
@@ -1009,7 +915,7 @@
     <w:basedOn w:val="DefaultParagraphFont"/>
     <w:link w:val="Title"/>
     <w:uiPriority w:val="10"/>
-    <w:rsid w:val="006A5A9F"/>
+    <w:rsid w:val="00290F89"/>
     <w:rPr>
       <w:rFonts w:asciiTheme="majorHAnsi" w:eastAsiaTheme="majorEastAsia" w:hAnsiTheme="majorHAnsi" w:cstheme="majorBidi"/>
       <w:spacing w:val="-10"/>
@@ -1025,12 +931,11 @@
     <w:link w:val="SubtitleChar"/>
     <w:uiPriority w:val="11"/>
     <w:qFormat/>
-    <w:rsid w:val="006A5A9F"/>
+    <w:rsid w:val="00290F89"/>
     <w:pPr>
       <w:numPr>
         <w:ilvl w:val="1"/>
       </w:numPr>
-      <w:spacing w:after="160"/>
     </w:pPr>
     <w:rPr>
       <w:rFonts w:eastAsiaTheme="majorEastAsia" w:cstheme="majorBidi"/>
@@ -1045,7 +950,7 @@
     <w:basedOn w:val="DefaultParagraphFont"/>
     <w:link w:val="Subtitle"/>
     <w:uiPriority w:val="11"/>
-    <w:rsid w:val="006A5A9F"/>
+    <w:rsid w:val="00290F89"/>
     <w:rPr>
       <w:rFonts w:eastAsiaTheme="majorEastAsia" w:cstheme="majorBidi"/>
       <w:color w:val="595959" w:themeColor="text1" w:themeTint="A6"/>
@@ -1061,9 +966,9 @@
     <w:link w:val="QuoteChar"/>
     <w:uiPriority w:val="29"/>
     <w:qFormat/>
-    <w:rsid w:val="006A5A9F"/>
+    <w:rsid w:val="00290F89"/>
     <w:pPr>
-      <w:spacing w:before="160" w:after="160"/>
+      <w:spacing w:before="160"/>
       <w:jc w:val="center"/>
     </w:pPr>
     <w:rPr>
@@ -1077,7 +982,7 @@
     <w:basedOn w:val="DefaultParagraphFont"/>
     <w:link w:val="Quote"/>
     <w:uiPriority w:val="29"/>
-    <w:rsid w:val="006A5A9F"/>
+    <w:rsid w:val="00290F89"/>
     <w:rPr>
       <w:i/>
       <w:iCs/>
@@ -1089,7 +994,7 @@
     <w:basedOn w:val="Normal"/>
     <w:uiPriority w:val="34"/>
     <w:qFormat/>
-    <w:rsid w:val="006A5A9F"/>
+    <w:rsid w:val="00290F89"/>
     <w:pPr>
       <w:ind w:left="720"/>
       <w:contextualSpacing/>
@@ -1100,7 +1005,7 @@
     <w:basedOn w:val="DefaultParagraphFont"/>
     <w:uiPriority w:val="21"/>
     <w:qFormat/>
-    <w:rsid w:val="006A5A9F"/>
+    <w:rsid w:val="00290F89"/>
     <w:rPr>
       <w:i/>
       <w:iCs/>
@@ -1114,7 +1019,7 @@
     <w:link w:val="IntenseQuoteChar"/>
     <w:uiPriority w:val="30"/>
     <w:qFormat/>
-    <w:rsid w:val="006A5A9F"/>
+    <w:rsid w:val="00290F89"/>
     <w:pPr>
       <w:pBdr>
         <w:top w:val="single" w:sz="4" w:space="10" w:color="0F4761" w:themeColor="accent1" w:themeShade="BF"/>
@@ -1135,7 +1040,7 @@
     <w:basedOn w:val="DefaultParagraphFont"/>
     <w:link w:val="IntenseQuote"/>
     <w:uiPriority w:val="30"/>
-    <w:rsid w:val="006A5A9F"/>
+    <w:rsid w:val="00290F89"/>
     <w:rPr>
       <w:i/>
       <w:iCs/>
@@ -1147,13 +1052,33 @@
     <w:basedOn w:val="DefaultParagraphFont"/>
     <w:uiPriority w:val="32"/>
     <w:qFormat/>
-    <w:rsid w:val="006A5A9F"/>
+    <w:rsid w:val="00290F89"/>
     <w:rPr>
       <w:b/>
       <w:bCs/>
       <w:smallCaps/>
       <w:color w:val="0F4761" w:themeColor="accent1" w:themeShade="BF"/>
       <w:spacing w:val="5"/>
+    </w:rPr>
+  </w:style>
+  <w:style w:type="paragraph" w:styleId="Caption">
+    <w:name w:val="caption"/>
+    <w:basedOn w:val="Normal"/>
+    <w:next w:val="Normal"/>
+    <w:uiPriority w:val="35"/>
+    <w:unhideWhenUsed/>
+    <w:qFormat/>
+    <w:rsid w:val="00290F89"/>
+    <w:pPr>
+      <w:spacing w:after="200" w:line="240" w:lineRule="auto"/>
+      <w:contextualSpacing/>
+    </w:pPr>
+    <w:rPr>
+      <w:i/>
+      <w:iCs/>
+      <w:color w:val="0E2841" w:themeColor="text2"/>
+      <w:sz w:val="18"/>
+      <w:szCs w:val="18"/>
     </w:rPr>
   </w:style>
 </w:styles>
@@ -1257,7 +1182,7 @@
         <a:latin typeface="Aptos" panose="02110004020202020204"/>
         <a:ea typeface=""/>
         <a:cs typeface=""/>
-        <a:font script="Jpan" typeface="游ゴシック"/>
+        <a:font script="Jpan" typeface="游明朝"/>
         <a:font script="Hang" typeface="맑은 고딕"/>
         <a:font script="Hans" typeface="等线"/>
         <a:font script="Hant" typeface="新細明體"/>
@@ -1365,13 +1290,6 @@
         </a:gradFill>
       </a:fillStyleLst>
       <a:lnStyleLst>
-        <a:ln w="6350" cap="flat" cmpd="sng" algn="ctr">
-          <a:solidFill>
-            <a:schemeClr val="phClr"/>
-          </a:solidFill>
-          <a:prstDash val="solid"/>
-          <a:miter lim="800000"/>
-        </a:ln>
         <a:ln w="12700" cap="flat" cmpd="sng" algn="ctr">
           <a:solidFill>
             <a:schemeClr val="phClr"/>
@@ -1380,6 +1298,13 @@
           <a:miter lim="800000"/>
         </a:ln>
         <a:ln w="19050" cap="flat" cmpd="sng" algn="ctr">
+          <a:solidFill>
+            <a:schemeClr val="phClr"/>
+          </a:solidFill>
+          <a:prstDash val="solid"/>
+          <a:miter lim="800000"/>
+        </a:ln>
+        <a:ln w="25400" cap="flat" cmpd="sng" algn="ctr">
           <a:solidFill>
             <a:schemeClr val="phClr"/>
           </a:solidFill>
@@ -1444,11 +1369,31 @@
       </a:bgFillStyleLst>
     </a:fmtScheme>
   </a:themeElements>
-  <a:objectDefaults/>
+  <a:objectDefaults>
+    <a:lnDef>
+      <a:spPr/>
+      <a:bodyPr/>
+      <a:lstStyle/>
+      <a:style>
+        <a:lnRef idx="2">
+          <a:schemeClr val="accent1"/>
+        </a:lnRef>
+        <a:fillRef idx="0">
+          <a:schemeClr val="accent1"/>
+        </a:fillRef>
+        <a:effectRef idx="1">
+          <a:schemeClr val="accent1"/>
+        </a:effectRef>
+        <a:fontRef idx="minor">
+          <a:schemeClr val="tx1"/>
+        </a:fontRef>
+      </a:style>
+    </a:lnDef>
+  </a:objectDefaults>
   <a:extraClrSchemeLst/>
   <a:extLst>
     <a:ext uri="{05A4C25C-085E-4340-85A3-A5531E510DB2}">
-      <thm15:themeFamily xmlns:thm15="http://schemas.microsoft.com/office/thememl/2012/main" name="Office Theme" id="{62F939B6-93AF-4DB8-9C6B-D6C7DFDC589F}" vid="{4A3C46E8-61CC-4603-A589-7422A47A8E4A}"/>
+      <thm15:themeFamily xmlns:thm15="http://schemas.microsoft.com/office/thememl/2012/main" name="Office Theme" id="{2E142A2C-CD16-42D6-873A-C26D2A0506FA}" vid="{1BDDFF52-6CD6-40A5-AB3C-68EB2F1E4D0A}"/>
     </a:ext>
   </a:extLst>
 </a:theme>
@@ -1459,7 +1404,7 @@
 </file>
 
 <file path=customXml/itemProps1.xml><?xml version="1.0" encoding="utf-8"?>
-<ds:datastoreItem xmlns:ds="http://schemas.openxmlformats.org/officeDocument/2006/customXml" ds:itemID="{2C8848F1-298D-B043-B858-936A0F17123D}">
+<ds:datastoreItem xmlns:ds="http://schemas.openxmlformats.org/officeDocument/2006/customXml" ds:itemID="{EE0E4930-840C-A54A-8550-C1A1F80696F1}">
   <ds:schemaRefs>
     <ds:schemaRef ds:uri="http://schemas.openxmlformats.org/officeDocument/2006/bibliography"/>
   </ds:schemaRefs>

</xml_diff>